<commit_message>
Reposition CV's RENMONEY section as portfolio owner, not BI executor
Rewrite the current-role section to lead with ownership, strategy and
risk decisioning instead of the tools used to do it: portfolio P&L
break-even, the full risk metric suite (ECL, FPD, roll-rate, PAR, NPL),
credit policy design (eligibility, pricing, DTI, high-risk overlays,
routing/graduation), the email-similarity fraud catch later adopted by
Data Science, and A/B testing — with Power BI/SQL now the closing
"how" bullet rather than the headline. Updates real figures (15% approval,
20% impairment, 58% FPD30 improvement) and drops the "— Data Analytics &
Risk Analytics" subtitle. Also extends the Skills section (cohort/vintage
analysis, collections analytics, statistical testing, DAX, star-schema,
semantic modelling, Power Query, VBA) to match what the portfolio site
already claims.

Co-Authored-By: Claude Sonnet 5 <noreply@anthropic.com>
</commit_message>
<xml_diff>
--- a/Gbolahan-Towobola-Resume.docx
+++ b/Gbolahan-Towobola-Resume.docx
@@ -183,7 +183,7 @@
           <w:sz w:val="21"/>
           <w:szCs w:val="21"/>
         </w:rPr>
-        <w:t>Credit Portfolio Manager — Data Analytics &amp; Risk Analytics</w:t>
+        <w:t>Credit Portfolio Manager</w:t>
       </w:r>
       <w:r>
         <w:rPr>
@@ -255,7 +255,7 @@
         <w:spacing w:after="60" w:line="252" w:lineRule="auto"/>
       </w:pPr>
       <w:r>
-        <w:t>Increased credit approval rates by 50% while maintaining portfolio quality by analyzing customer risk profiles, segmenting the loan portfolio, and optimizing lending strategies across digital products.</w:t>
+        <w:t>Drove the portfolio to P&amp;L break-even within two years of taking ownership, optimizing credit growth, exposure, pricing, risk controls and portfolio economics to improve profitability without compromising credit quality.</w:t>
       </w:r>
     </w:p>
     <w:p>
@@ -268,10 +268,7 @@
         <w:spacing w:after="60" w:line="252" w:lineRule="auto"/>
       </w:pPr>
       <w:r>
-        <w:rPr>
-          <w:color w:val="000000"/>
-        </w:rPr>
-        <w:t>Developed executive Power BI dashboards that provided the CEO and Risk Committee with real-time visibility into approvals, portfolio performance, delinquency, collections, and key business KPIs.</w:t>
+        <w:t>Expanded access to credit while reducing portfolio risk, redesigning eligibility, requalification and rejected-customer re-entry strategies to increase approvals by 15%, reduce impairment by 20%, and improve FPD30 by 58%.</w:t>
       </w:r>
     </w:p>
     <w:p>
@@ -284,7 +281,7 @@
         <w:spacing w:after="60" w:line="252" w:lineRule="auto"/>
       </w:pPr>
       <w:r>
-        <w:t>Queried and analyzed millions of loan records using advanced SQL (CTEs, window functions, and complex joins) to generate actionable insights and support strategic business decisions.</w:t>
+        <w:t>Own portfolio performance and risk monitoring across approval, disbursal, exposure, revenue, risk-adjusted Gross Profit, ECL, FPD, roll rates, PAR and NPL, identifying material risk, economic leakage and profitable growth opportunities before they impact reported performance.</w:t>
       </w:r>
     </w:p>
     <w:p>
@@ -297,7 +294,7 @@
         <w:spacing w:after="60" w:line="252" w:lineRule="auto"/>
       </w:pPr>
       <w:r>
-        <w:t>Designed and evaluated A/B testing frameworks to measure the impact of proposed credit policy changes on approval rates, portfolio quality, customer growth, and profitability.</w:t>
+        <w:t>Optimized risk-based lending economics by redesigning exposure limits, pricing and tenure across risk bands, while improving DTI, affordability and income-source treatment to align customer offers with observed repayment risk.</w:t>
       </w:r>
     </w:p>
     <w:p>
@@ -310,7 +307,7 @@
         <w:spacing w:after="60" w:line="252" w:lineRule="auto"/>
       </w:pPr>
       <w:r>
-        <w:t>Built a centralized business intelligence platform by integrating data across Risk, Finance, Collections, and Product teams, improving reporting consistency and enabling self-service analytics.</w:t>
+        <w:t>Designed credit policy architecture for high-risk treatments, policy overlays, customer routing and graduation, enabling differentiated treatment based on risk and customer performance.</w:t>
       </w:r>
     </w:p>
     <w:p>
@@ -323,73 +320,7 @@
         <w:spacing w:after="60" w:line="252" w:lineRule="auto"/>
       </w:pPr>
       <w:r>
-        <w:t>Reduced reporting turnaround time and improved data accuracy by designing automated SQL data pipelines in Amazon Redshift to transform, validate, and aggregate large-scale lending datasets.</w:t>
-      </w:r>
-    </w:p>
-    <w:p>
-      <w:pPr>
-        <w:tabs>
-          <w:tab w:val="right" w:pos="10080"/>
-        </w:tabs>
-        <w:spacing w:before="140"/>
-        <w:rPr>
-          <w:i/>
-          <w:iCs/>
-          <w:color w:val="595959"/>
-          <w:sz w:val="18"/>
-          <w:szCs w:val="18"/>
-        </w:rPr>
-      </w:pPr>
-      <w:r>
-        <w:rPr>
-          <w:b/>
-          <w:bCs/>
-          <w:sz w:val="21"/>
-          <w:szCs w:val="21"/>
-        </w:rPr>
-        <w:t xml:space="preserve">Business Intelligence Team Lead</w:t>
-      </w:r>
-      <w:r>
-        <w:rPr>
-          <w:sz w:val="21"/>
-          <w:szCs w:val="21"/>
-        </w:rPr>
-        <w:t xml:space="preserve"> |</w:t>
-      </w:r>
-      <w:r>
-        <w:rPr>
-          <w:b/>
-          <w:bCs/>
-          <w:sz w:val="21"/>
-          <w:szCs w:val="21"/>
-        </w:rPr>
-        <w:t xml:space="preserve"> PALMPAY </w:t>
-      </w:r>
-      <w:r>
-        <w:rPr>
-          <w:i/>
-          <w:iCs/>
-          <w:color w:val="595959"/>
-          <w:sz w:val="18"/>
-          <w:szCs w:val="18"/>
-        </w:rPr>
-        <w:tab/>
-        <w:t>Aug 2021 – Mar 2023</w:t>
-      </w:r>
-    </w:p>
-    <w:p>
-      <w:pPr>
-        <w:tabs>
-          <w:tab w:val="right" w:pos="10080"/>
-        </w:tabs>
-        <w:spacing w:after="40"/>
-      </w:pPr>
-      <w:r>
-        <w:rPr>
-          <w:i/>
-          <w:iCs/>
-        </w:rPr>
-        <w:t>Digital payments &amp; financial services</w:t>
+        <w:t>Built and evaluated A/B testing frameworks for credit policy changes, including limits, score bands and affordability rules, using sample-ratio checks, covariate balance and statistical significance to quantify impact and downside risk before implementation.</w:t>
       </w:r>
     </w:p>
     <w:p>
@@ -402,10 +333,7 @@
         <w:spacing w:after="60" w:line="252" w:lineRule="auto"/>
       </w:pPr>
       <w:r>
-        <w:rPr>
-          <w:color w:val="000000"/>
-        </w:rPr>
-        <w:t xml:space="preserve">Contributed directly to revenue growth of 30%, by designing end-to-end BI solutions that automated analysis of transactional, operational, and customer data to show growth opportunities.</w:t>
+        <w:t>Identified a previously undetected fraud pattern through loan-application analysis and developed an email-similarity model to flag related applications; the approach was subsequently adopted and further developed by the Data Science team for production use.</w:t>
       </w:r>
     </w:p>
     <w:p>
@@ -418,10 +346,73 @@
         <w:spacing w:after="60" w:line="252" w:lineRule="auto"/>
       </w:pPr>
       <w:r>
-        <w:rPr>
-          <w:color w:val="000000"/>
-        </w:rPr>
-        <w:t>Ensured data-driven decision-making across sales, marketing, and operations, by creating and maintaining 10+ interactive dashboards tailored to each department.</w:t>
+        <w:t>Built executive Power BI reporting and SQL/Redshift pipelines used by senior management and the Risk Committee, providing a trusted portfolio performance layer with metrics traceable to source data.</w:t>
+      </w:r>
+    </w:p>
+    <w:p>
+      <w:pPr>
+        <w:tabs>
+          <w:tab w:val="right" w:pos="10080"/>
+        </w:tabs>
+        <w:spacing w:before="140"/>
+        <w:rPr>
+          <w:i/>
+          <w:iCs/>
+          <w:color w:val="595959"/>
+          <w:sz w:val="18"/>
+          <w:szCs w:val="18"/>
+        </w:rPr>
+      </w:pPr>
+      <w:r>
+        <w:rPr>
+          <w:b/>
+          <w:bCs/>
+          <w:sz w:val="21"/>
+          <w:szCs w:val="21"/>
+        </w:rPr>
+        <w:t xml:space="preserve">Business Intelligence Team Lead</w:t>
+      </w:r>
+      <w:r>
+        <w:rPr>
+          <w:sz w:val="21"/>
+          <w:szCs w:val="21"/>
+        </w:rPr>
+        <w:t xml:space="preserve"> |</w:t>
+      </w:r>
+      <w:r>
+        <w:rPr>
+          <w:b/>
+          <w:bCs/>
+          <w:sz w:val="21"/>
+          <w:szCs w:val="21"/>
+        </w:rPr>
+        <w:t xml:space="preserve"> PALMPAY </w:t>
+      </w:r>
+      <w:r>
+        <w:rPr>
+          <w:i/>
+          <w:iCs/>
+          <w:color w:val="595959"/>
+          <w:sz w:val="18"/>
+          <w:szCs w:val="18"/>
+        </w:rPr>
+        <w:tab/>
+        <w:t>Aug 2021 – Mar 2023</w:t>
+      </w:r>
+    </w:p>
+    <w:p>
+      <w:pPr>
+        <w:tabs>
+          <w:tab w:val="right" w:pos="10080"/>
+        </w:tabs>
+        <w:spacing w:after="40"/>
+      </w:pPr>
+      <w:r>
+        <w:rPr>
+          <w:i/>
+          <w:iCs/>
+        </w:rPr>
+        <w:t>Digital payments &amp; financial services</w:t>
       </w:r>
     </w:p>
     <w:p>
@@ -437,6 +428,38 @@
         <w:rPr>
           <w:color w:val="000000"/>
         </w:rPr>
+        <w:t xml:space="preserve">Contributed directly to revenue growth of 30%, by designing end-to-end BI solutions that automated analysis of transactional, operational, and customer data to show growth opportunities.</w:t>
+      </w:r>
+    </w:p>
+    <w:p>
+      <w:pPr>
+        <w:pStyle w:val="ListParagraph"/>
+        <w:numPr>
+          <w:ilvl w:val="0"/>
+          <w:numId w:val="2"/>
+        </w:numPr>
+        <w:spacing w:after="60" w:line="252" w:lineRule="auto"/>
+      </w:pPr>
+      <w:r>
+        <w:rPr>
+          <w:color w:val="000000"/>
+        </w:rPr>
+        <w:t>Ensured data-driven decision-making across sales, marketing, and operations, by creating and maintaining 10+ interactive dashboards tailored to each department.</w:t>
+      </w:r>
+    </w:p>
+    <w:p>
+      <w:pPr>
+        <w:pStyle w:val="ListParagraph"/>
+        <w:numPr>
+          <w:ilvl w:val="0"/>
+          <w:numId w:val="2"/>
+        </w:numPr>
+        <w:spacing w:after="60" w:line="252" w:lineRule="auto"/>
+      </w:pPr>
+      <w:r>
+        <w:rPr>
+          <w:color w:val="000000"/>
+        </w:rPr>
         <w:t>Enabled teams to hit quarterly targets, by leading development of a company-wide sales performance reporting system and providing technical leadership across all BI project phases, from discovery to delivery.</w:t>
       </w:r>
     </w:p>
@@ -810,7 +833,7 @@
         <w:rPr>
           <w:color w:val="000000"/>
         </w:rPr>
-        <w:t>Credit policy design &amp; review, underwriting analytics, credit scoring model evaluation, decision-engine rule validation, loan limit &amp; ticket size strategy, A/B testing &amp; simulation, portfolio monitoring (DPD, delinquency, roll rates, loan progression, rollovers/extensions), risk-based segmentation</w:t>
+        <w:t>Credit policy design &amp; review, underwriting analytics, credit scoring model evaluation, decision-engine rule validation, loan limit &amp; ticket size strategy, A/B testing &amp; simulation, cohort/vintage analysis, collections analytics, portfolio monitoring (DPD, delinquency, roll rates, loan progression, rollovers/extensions), risk-based segmentation</w:t>
       </w:r>
     </w:p>
     <w:p>
@@ -834,7 +857,7 @@
         <w:rPr>
           <w:color w:val="000000"/>
         </w:rPr>
-        <w:t>SQL (Amazon Redshift, PostgreSQL, MySQL), Python (Pandas, Matplotlib, Seaborn), data pipeline development, automated reporting</w:t>
+        <w:t>SQL (Amazon Redshift, PostgreSQL, MySQL), Python (Pandas, Matplotlib, Seaborn), statistical testing, data pipeline development, automated reporting</w:t>
       </w:r>
     </w:p>
     <w:p>
@@ -858,7 +881,7 @@
         <w:rPr>
           <w:color w:val="000000"/>
         </w:rPr>
-        <w:t>Power BI (MIS/dashboards for executive and board-level audiences), Microsoft Power Platform, executive presentation &amp; risk committee reporting</w:t>
+        <w:t>Power BI (semantic modelling, DAX, star-schema data models, Power Query), MIS/dashboards for executive and board-level audiences, Microsoft Power Platform, Excel &amp; VBA, executive presentation &amp; risk committee reporting</w:t>
       </w:r>
     </w:p>
     <w:p>

</xml_diff>

<commit_message>
Tighten RENMONEY bullets: 8 -> 7, drop rhetorical em dashes
Consolidate the pricing/DTI and high-risk-treatment bullets into one,
reword it (and the ownership bullet) so they read as decisions made
rather than a restated duty list, and remove em dashes from the bullet
copy per feedback.

Co-Authored-By: Claude Sonnet 5 <noreply@anthropic.com>
</commit_message>
<xml_diff>
--- a/Gbolahan-Towobola-Resume.docx
+++ b/Gbolahan-Towobola-Resume.docx
@@ -255,7 +255,7 @@
         <w:spacing w:after="60" w:line="252" w:lineRule="auto"/>
       </w:pPr>
       <w:r>
-        <w:t>Drove the portfolio to P&amp;L break-even within two years of taking ownership, optimizing credit growth, exposure, pricing, risk controls and portfolio economics to improve profitability without compromising credit quality.</w:t>
+        <w:t>Drove the portfolio to P&amp;L break-even within two years of taking ownership, optimizing credit growth, exposure, pricing, risk controls and portfolio economics to improve profitability while maintaining credit quality.</w:t>
       </w:r>
     </w:p>
     <w:p>
@@ -268,7 +268,7 @@
         <w:spacing w:after="60" w:line="252" w:lineRule="auto"/>
       </w:pPr>
       <w:r>
-        <w:t>Expanded access to credit while reducing portfolio risk, redesigning eligibility, requalification and rejected-customer re-entry strategies to increase approvals by 15%, reduce impairment by 20%, and improve FPD30 by 58%.</w:t>
+        <w:t>Expanded access to credit while reducing portfolio risk, redesigning eligibility and customer segmentation strategies to increase approvals by 15%, reduce impairment by 20%, and improve FPD30 by 58%.</w:t>
       </w:r>
     </w:p>
     <w:p>
@@ -281,7 +281,7 @@
         <w:spacing w:after="60" w:line="252" w:lineRule="auto"/>
       </w:pPr>
       <w:r>
-        <w:t>Own portfolio performance and risk monitoring across approval, disbursal, exposure, revenue, risk-adjusted Gross Profit, ECL, FPD, roll rates, PAR and NPL, identifying material risk, economic leakage and profitable growth opportunities before they impact reported performance.</w:t>
+        <w:t>Own end-to-end portfolio performance and risk monitoring, spanning onboarding, application and eligibility through FPD, roll rates, PAR and NPL; use segmentation and cohort analysis to identify emerging risk, economic leakage and profitable growth opportunities across the portfolio.</w:t>
       </w:r>
     </w:p>
     <w:p>
@@ -294,7 +294,7 @@
         <w:spacing w:after="60" w:line="252" w:lineRule="auto"/>
       </w:pPr>
       <w:r>
-        <w:t>Optimized risk-based lending economics by redesigning exposure limits, pricing and tenure across risk bands, while improving DTI, affordability and income-source treatment to align customer offers with observed repayment risk.</w:t>
+        <w:t>Replaced flat, one-size-fits-all lending terms with pricing, exposure limits and DTI/affordability treatment set by risk band, so stronger-risk customers earn better terms while weaker-risk customers are held to the overlays and routing rules that protect portfolio economics.</w:t>
       </w:r>
     </w:p>
     <w:p>
@@ -307,7 +307,7 @@
         <w:spacing w:after="60" w:line="252" w:lineRule="auto"/>
       </w:pPr>
       <w:r>
-        <w:t>Designed credit policy architecture for high-risk treatments, policy overlays, customer routing and graduation, enabling differentiated treatment based on risk and customer performance.</w:t>
+        <w:t>Built and evaluated A/B testing frameworks for credit policy changes, including limits, score bands and affordability rules, using sample-ratio checks, covariate balance and statistical significance to quantify expected impact and downside risk before implementation.</w:t>
       </w:r>
     </w:p>
     <w:p>
@@ -320,7 +320,7 @@
         <w:spacing w:after="60" w:line="252" w:lineRule="auto"/>
       </w:pPr>
       <w:r>
-        <w:t>Built and evaluated A/B testing frameworks for credit policy changes, including limits, score bands and affordability rules, using sample-ratio checks, covariate balance and statistical significance to quantify impact and downside risk before implementation.</w:t>
+        <w:t>Identified a previously undetected fraud pattern through loan-application analysis and developed an email-similarity model to flag related applications; the approach was subsequently adopted and further developed by the Data Science team for production use.</w:t>
       </w:r>
     </w:p>
     <w:p>
@@ -333,20 +333,7 @@
         <w:spacing w:after="60" w:line="252" w:lineRule="auto"/>
       </w:pPr>
       <w:r>
-        <w:t>Identified a previously undetected fraud pattern through loan-application analysis and developed an email-similarity model to flag related applications; the approach was subsequently adopted and further developed by the Data Science team for production use.</w:t>
-      </w:r>
-    </w:p>
-    <w:p>
-      <w:pPr>
-        <w:pStyle w:val="ListParagraph"/>
-        <w:numPr>
-          <w:ilvl w:val="0"/>
-          <w:numId w:val="2"/>
-        </w:numPr>
-        <w:spacing w:after="60" w:line="252" w:lineRule="auto"/>
-      </w:pPr>
-      <w:r>
-        <w:t>Built executive Power BI reporting and SQL/Redshift pipelines used by senior management and the Risk Committee, providing a trusted portfolio performance layer with metrics traceable to source data.</w:t>
+        <w:t>Built executive Power BI reporting and SQL/Redshift pipelines used by senior management and the Risk Committee, providing a trusted portfolio-performance layer with metrics traceable to source data.</w:t>
       </w:r>
     </w:p>
     <w:p>

</xml_diff>